<commit_message>
working analysis before project refactor
</commit_message>
<xml_diff>
--- a/reports/AGU_Manuscript_Word_tracers.docx
+++ b/reports/AGU_Manuscript_Word_tracers.docx
@@ -219,7 +219,21 @@
             <w:rStyle w:val="Hyperlink"/>
             <w:rFonts w:asciiTheme="minorHAnsi" w:hAnsiTheme="minorHAnsi" w:cstheme="minorHAnsi"/>
           </w:rPr>
-          <w:t>https://www.agu.org/Publish-with-AGU/Publish</w:t>
+          <w:t>https://www.ag</w:t>
+        </w:r>
+        <w:r>
+          <w:rPr>
+            <w:rStyle w:val="Hyperlink"/>
+            <w:rFonts w:asciiTheme="minorHAnsi" w:hAnsiTheme="minorHAnsi" w:cstheme="minorHAnsi"/>
+          </w:rPr>
+          <w:t>u</w:t>
+        </w:r>
+        <w:r>
+          <w:rPr>
+            <w:rStyle w:val="Hyperlink"/>
+            <w:rFonts w:asciiTheme="minorHAnsi" w:hAnsiTheme="minorHAnsi" w:cstheme="minorHAnsi"/>
+          </w:rPr>
+          <w:t>.org/Publish-with-AGU/Publish</w:t>
         </w:r>
       </w:hyperlink>
       <w:r>
@@ -901,7 +915,7 @@
       </w:pPr>
       <w:r>
         <w:rPr>
-          <w:rFonts w:ascii="Calibri" w:hAnsi="Calibri" w:cs="Calibri"/>
+          <w:rFonts w:asciiTheme="minorHAnsi" w:hAnsiTheme="minorHAnsi" w:cstheme="minorHAnsi"/>
         </w:rPr>
         <w:lastRenderedPageBreak/>
         <w:t>Ventilation Changes in the Labrador Sea from 2015–2025 Inferred from Transit Time Distributions of SF₆ and CFC-12</w:t>
@@ -1459,418 +1473,387 @@
     <w:p>
       <w:pPr>
         <w:rPr>
-          <w:rFonts w:ascii="Calibri" w:hAnsi="Calibri" w:cs="Calibri"/>
-        </w:rPr>
-      </w:pPr>
-      <w:r>
-        <w:rPr>
-          <w:rFonts w:ascii="Calibri" w:hAnsi="Calibri" w:cs="Calibri"/>
-        </w:rPr>
-        <w:t xml:space="preserve">About 30 percent of the subpolar North Atlantic ocean is ventilated which occurs mainly in the central Labrador Sea.  The Labrador sea water is formed </w:t>
-      </w:r>
-      <w:r>
-        <w:rPr>
-          <w:rFonts w:ascii="Calibri" w:hAnsi="Calibri" w:cs="Calibri"/>
-        </w:rPr>
-        <w:t xml:space="preserve">by winter time deep convection where the resulting water mass is homogeneous with a lower salinity, cooler temperatures and low stability (Rhein et al., 2002, Lazier et al., 2002, Yash). </w:t>
-      </w:r>
-      <w:r>
-        <w:rPr>
-          <w:rFonts w:ascii="Calibri" w:hAnsi="Calibri" w:cs="Calibri"/>
-        </w:rPr>
-        <w:t xml:space="preserve"> Labrador sea water is a main contributor to the deep water masses of the North Atlantic.    T</w:t>
-      </w:r>
-      <w:r>
-        <w:rPr>
-          <w:rFonts w:ascii="Calibri" w:hAnsi="Calibri" w:cs="Calibri"/>
-        </w:rPr>
-        <w:t xml:space="preserve">he convection depth observed over multiple years </w:t>
-      </w:r>
-      <w:r>
-        <w:rPr>
-          <w:rFonts w:ascii="Calibri" w:hAnsi="Calibri" w:cs="Calibri"/>
-        </w:rPr>
-        <w:t>has</w:t>
-      </w:r>
-      <w:r>
-        <w:rPr>
-          <w:rFonts w:ascii="Calibri" w:hAnsi="Calibri" w:cs="Calibri"/>
-        </w:rPr>
-        <w:t xml:space="preserve"> a pattern of deepening progressively before a period of relaxation occurs, this periodic cycling has been documented since the early 60s  (Lazier 1988).  The deep convection events ventilate the deep ocean with atmospheric gases such as oxygen, carbon dioxide and anthropogenic gases such as the transient tracers </w:t>
-      </w:r>
-      <w:proofErr w:type="spellStart"/>
-      <w:r>
-        <w:rPr>
-          <w:rFonts w:ascii="Calibri" w:hAnsi="Calibri" w:cs="Calibri"/>
-        </w:rPr>
-        <w:t>chloroflurocarbons</w:t>
-      </w:r>
-      <w:proofErr w:type="spellEnd"/>
-      <w:r>
-        <w:rPr>
-          <w:rFonts w:ascii="Calibri" w:hAnsi="Calibri" w:cs="Calibri"/>
-        </w:rPr>
-        <w:t xml:space="preserve"> (CFCs) and sulfur </w:t>
-      </w:r>
-      <w:proofErr w:type="spellStart"/>
-      <w:r>
-        <w:rPr>
-          <w:rFonts w:ascii="Calibri" w:hAnsi="Calibri" w:cs="Calibri"/>
-        </w:rPr>
-        <w:t>hexafloride</w:t>
-      </w:r>
-      <w:proofErr w:type="spellEnd"/>
-      <w:r>
-        <w:rPr>
-          <w:rFonts w:ascii="Calibri" w:hAnsi="Calibri" w:cs="Calibri"/>
-        </w:rPr>
-        <w:t xml:space="preserve"> (SF6). </w:t>
-      </w:r>
-      <w:r>
-        <w:rPr>
-          <w:rFonts w:ascii="Calibri" w:hAnsi="Calibri" w:cs="Calibri"/>
+          <w:rFonts w:asciiTheme="minorHAnsi" w:hAnsiTheme="minorHAnsi" w:cstheme="minorHAnsi"/>
+        </w:rPr>
+      </w:pPr>
+      <w:r>
+        <w:rPr>
+          <w:rFonts w:asciiTheme="minorHAnsi" w:hAnsiTheme="minorHAnsi" w:cstheme="minorHAnsi"/>
+        </w:rPr>
+        <w:t xml:space="preserve">About 30 percent </w:t>
+      </w:r>
+      <w:r>
+        <w:rPr>
+          <w:rFonts w:asciiTheme="minorHAnsi" w:hAnsiTheme="minorHAnsi" w:cstheme="minorHAnsi"/>
+        </w:rPr>
+        <w:t xml:space="preserve">of the </w:t>
+      </w:r>
+      <w:r>
+        <w:rPr>
+          <w:rFonts w:asciiTheme="minorHAnsi" w:hAnsiTheme="minorHAnsi" w:cstheme="minorHAnsi"/>
+        </w:rPr>
+        <w:t>subpolar North Atlantic ocean</w:t>
+      </w:r>
+      <w:r>
+        <w:rPr>
+          <w:rFonts w:asciiTheme="minorHAnsi" w:hAnsiTheme="minorHAnsi" w:cstheme="minorHAnsi"/>
+        </w:rPr>
+        <w:t xml:space="preserve"> is </w:t>
+      </w:r>
+      <w:r>
+        <w:rPr>
+          <w:rFonts w:asciiTheme="minorHAnsi" w:hAnsiTheme="minorHAnsi" w:cstheme="minorHAnsi"/>
+        </w:rPr>
+        <w:t>ventilated</w:t>
+      </w:r>
+      <w:r>
+        <w:rPr>
+          <w:rFonts w:asciiTheme="minorHAnsi" w:hAnsiTheme="minorHAnsi" w:cstheme="minorHAnsi"/>
+        </w:rPr>
+        <w:t xml:space="preserve">, the main site of ventilation </w:t>
+      </w:r>
+      <w:r>
+        <w:rPr>
+          <w:rFonts w:asciiTheme="minorHAnsi" w:hAnsiTheme="minorHAnsi" w:cstheme="minorHAnsi"/>
+        </w:rPr>
+        <w:t xml:space="preserve">occurs in the central Labrador Sea.  </w:t>
+      </w:r>
+      <w:r>
+        <w:rPr>
+          <w:rFonts w:asciiTheme="minorHAnsi" w:hAnsiTheme="minorHAnsi" w:cstheme="minorHAnsi"/>
+        </w:rPr>
+        <w:t>Labrador sea water is a key contributor to the deep water masses of the North Atlantic (</w:t>
+      </w:r>
+      <w:r>
+        <w:rPr>
+          <w:rFonts w:asciiTheme="minorHAnsi" w:hAnsiTheme="minorHAnsi" w:cstheme="minorHAnsi"/>
+          <w:i/>
+          <w:iCs/>
+        </w:rPr>
+        <w:t>Keike &amp; Yashayaev 2015, Rhein et al., 2017</w:t>
+      </w:r>
+      <w:r>
+        <w:rPr>
+          <w:rFonts w:asciiTheme="minorHAnsi" w:hAnsiTheme="minorHAnsi" w:cstheme="minorHAnsi"/>
+        </w:rPr>
+        <w:t xml:space="preserve">).  </w:t>
+      </w:r>
+      <w:r>
+        <w:rPr>
+          <w:rFonts w:asciiTheme="minorHAnsi" w:hAnsiTheme="minorHAnsi" w:cstheme="minorHAnsi"/>
+        </w:rPr>
+        <w:t xml:space="preserve">Deep convection is initiated by high heat loss from the ocean’s surface which weakens or erases the density stratification in the water column.  </w:t>
+      </w:r>
+      <w:r>
+        <w:rPr>
+          <w:rFonts w:asciiTheme="minorHAnsi" w:hAnsiTheme="minorHAnsi" w:cstheme="minorHAnsi"/>
+        </w:rPr>
+        <w:t>The convection depth observed over multiple years has a pattern of deepening progressively before a period of relaxation occurs, this periodic cycling has been documented since the early 60s  (</w:t>
+      </w:r>
+      <w:r>
+        <w:rPr>
+          <w:rFonts w:asciiTheme="minorHAnsi" w:hAnsiTheme="minorHAnsi" w:cstheme="minorHAnsi"/>
+          <w:i/>
+          <w:iCs/>
+        </w:rPr>
+        <w:t>Lazier 1988</w:t>
+      </w:r>
+      <w:r>
+        <w:rPr>
+          <w:rFonts w:asciiTheme="minorHAnsi" w:hAnsiTheme="minorHAnsi" w:cstheme="minorHAnsi"/>
+        </w:rPr>
+        <w:t xml:space="preserve">).  </w:t>
+      </w:r>
+      <w:r>
+        <w:rPr>
+          <w:rFonts w:asciiTheme="minorHAnsi" w:hAnsiTheme="minorHAnsi" w:cstheme="minorHAnsi"/>
+        </w:rPr>
+        <w:t xml:space="preserve">The Labrador sea water </w:t>
+      </w:r>
+      <w:r>
+        <w:rPr>
+          <w:rFonts w:asciiTheme="minorHAnsi" w:hAnsiTheme="minorHAnsi" w:cstheme="minorHAnsi"/>
+        </w:rPr>
+        <w:t xml:space="preserve">(LSW) </w:t>
+      </w:r>
+      <w:r>
+        <w:rPr>
+          <w:rFonts w:asciiTheme="minorHAnsi" w:hAnsiTheme="minorHAnsi" w:cstheme="minorHAnsi"/>
+        </w:rPr>
+        <w:t>is formed by winter time deep convection where the resulting water mass is homogeneous with a lower salinity, cooler temperatures and low stability (</w:t>
+      </w:r>
+      <w:r>
+        <w:rPr>
+          <w:rFonts w:asciiTheme="minorHAnsi" w:hAnsiTheme="minorHAnsi" w:cstheme="minorHAnsi"/>
+          <w:i/>
+          <w:iCs/>
+        </w:rPr>
+        <w:t>Rhein et al., 2002, Lazier et al., 2002, Yash</w:t>
+      </w:r>
+      <w:r>
+        <w:rPr>
+          <w:rFonts w:asciiTheme="minorHAnsi" w:hAnsiTheme="minorHAnsi" w:cstheme="minorHAnsi"/>
+          <w:i/>
+          <w:iCs/>
+        </w:rPr>
+        <w:t xml:space="preserve">ayaev </w:t>
+      </w:r>
+      <w:r>
+        <w:rPr>
+          <w:rFonts w:asciiTheme="minorHAnsi" w:hAnsiTheme="minorHAnsi" w:cstheme="minorHAnsi"/>
+          <w:i/>
+          <w:iCs/>
+        </w:rPr>
+        <w:t>2007</w:t>
+      </w:r>
+      <w:r>
+        <w:rPr>
+          <w:rFonts w:asciiTheme="minorHAnsi" w:hAnsiTheme="minorHAnsi" w:cstheme="minorHAnsi"/>
+        </w:rPr>
+        <w:t xml:space="preserve">).  </w:t>
+      </w:r>
+      <w:r>
+        <w:rPr>
+          <w:rFonts w:asciiTheme="minorHAnsi" w:hAnsiTheme="minorHAnsi" w:cstheme="minorHAnsi"/>
+        </w:rPr>
+        <w:t xml:space="preserve">During </w:t>
+      </w:r>
+      <w:r>
+        <w:rPr>
+          <w:rFonts w:asciiTheme="minorHAnsi" w:hAnsiTheme="minorHAnsi" w:cstheme="minorHAnsi"/>
+        </w:rPr>
+        <w:t xml:space="preserve">formation, </w:t>
+      </w:r>
+      <w:r>
+        <w:rPr>
+          <w:rFonts w:asciiTheme="minorHAnsi" w:hAnsiTheme="minorHAnsi" w:cstheme="minorHAnsi"/>
+        </w:rPr>
+        <w:t xml:space="preserve">the surface </w:t>
+      </w:r>
+      <w:r>
+        <w:rPr>
+          <w:rFonts w:asciiTheme="minorHAnsi" w:hAnsiTheme="minorHAnsi" w:cstheme="minorHAnsi"/>
+        </w:rPr>
+        <w:t>gases</w:t>
+      </w:r>
+      <w:r>
+        <w:rPr>
+          <w:rFonts w:asciiTheme="minorHAnsi" w:hAnsiTheme="minorHAnsi" w:cstheme="minorHAnsi"/>
+        </w:rPr>
+        <w:t xml:space="preserve"> (oxygen, anthropogenic carbon, Cant, </w:t>
+      </w:r>
+      <w:r>
+        <w:rPr>
+          <w:rFonts w:asciiTheme="minorHAnsi" w:hAnsiTheme="minorHAnsi" w:cstheme="minorHAnsi"/>
+        </w:rPr>
+        <w:t>chlorofluorocarbons</w:t>
+      </w:r>
+      <w:r>
+        <w:rPr>
+          <w:rFonts w:asciiTheme="minorHAnsi" w:hAnsiTheme="minorHAnsi" w:cstheme="minorHAnsi"/>
         </w:rPr>
         <w:t xml:space="preserve"> </w:t>
       </w:r>
       <w:r>
         <w:rPr>
-          <w:rFonts w:ascii="Calibri" w:hAnsi="Calibri" w:cs="Calibri"/>
-        </w:rPr>
-        <w:t xml:space="preserve">Ventilation in the labrador sea </w:t>
-      </w:r>
-      <w:r>
-        <w:rPr>
-          <w:rFonts w:ascii="Calibri" w:hAnsi="Calibri" w:cs="Calibri"/>
-        </w:rPr>
-        <w:t>essentially transport surface waters to the oceans interior and interior water is transported back to the surface.  D</w:t>
-      </w:r>
-      <w:r>
-        <w:rPr>
-          <w:rFonts w:ascii="Calibri" w:hAnsi="Calibri" w:cs="Calibri"/>
-        </w:rPr>
-        <w:t>eep convection is brings atmospheric gases (oxygen, cfcs/sf6 and anthropogenic carbon) into the deep labrador ocean basin which then distributes these gases among other deep parts of the ocean.  Koelling et al., 2022 reported 1.6 x 10</w:t>
-      </w:r>
-      <w:r>
-        <w:rPr>
-          <w:rFonts w:ascii="Calibri" w:hAnsi="Calibri" w:cs="Calibri"/>
+          <w:rFonts w:asciiTheme="minorHAnsi" w:hAnsiTheme="minorHAnsi" w:cstheme="minorHAnsi"/>
+        </w:rPr>
+        <w:t xml:space="preserve">and </w:t>
+      </w:r>
+      <w:r>
+        <w:rPr>
+          <w:rFonts w:asciiTheme="minorHAnsi" w:hAnsiTheme="minorHAnsi" w:cstheme="minorHAnsi"/>
+        </w:rPr>
+        <w:t>s</w:t>
+      </w:r>
+      <w:r>
+        <w:rPr>
+          <w:rFonts w:asciiTheme="minorHAnsi" w:hAnsiTheme="minorHAnsi" w:cstheme="minorHAnsi"/>
+        </w:rPr>
+        <w:t>ulfur hexafluoride</w:t>
+      </w:r>
+      <w:r>
+        <w:rPr>
+          <w:rFonts w:asciiTheme="minorHAnsi" w:hAnsiTheme="minorHAnsi" w:cstheme="minorHAnsi"/>
+        </w:rPr>
+        <w:t xml:space="preserve">) are transported into the interior of the labrador sea, </w:t>
+      </w:r>
+      <w:r>
+        <w:rPr>
+          <w:rFonts w:asciiTheme="minorHAnsi" w:hAnsiTheme="minorHAnsi" w:cstheme="minorHAnsi"/>
+        </w:rPr>
+        <w:t>advected</w:t>
+      </w:r>
+      <w:r>
+        <w:rPr>
+          <w:rFonts w:asciiTheme="minorHAnsi" w:hAnsiTheme="minorHAnsi" w:cstheme="minorHAnsi"/>
+        </w:rPr>
+        <w:t xml:space="preserve"> </w:t>
+      </w:r>
+      <w:r>
+        <w:rPr>
+          <w:rFonts w:asciiTheme="minorHAnsi" w:hAnsiTheme="minorHAnsi" w:cstheme="minorHAnsi"/>
+        </w:rPr>
+        <w:t>horizontally</w:t>
+      </w:r>
+      <w:r>
+        <w:rPr>
+          <w:rFonts w:asciiTheme="minorHAnsi" w:hAnsiTheme="minorHAnsi" w:cstheme="minorHAnsi"/>
+        </w:rPr>
+        <w:t xml:space="preserve"> and entrained into the intermediate deep </w:t>
+      </w:r>
+      <w:r>
+        <w:rPr>
+          <w:rFonts w:asciiTheme="minorHAnsi" w:hAnsiTheme="minorHAnsi" w:cstheme="minorHAnsi"/>
+        </w:rPr>
+        <w:t>layers of</w:t>
+      </w:r>
+      <w:r>
+        <w:rPr>
+          <w:rFonts w:asciiTheme="minorHAnsi" w:hAnsiTheme="minorHAnsi" w:cstheme="minorHAnsi"/>
+        </w:rPr>
+        <w:t xml:space="preserve"> the Atlantic Ocean (</w:t>
+      </w:r>
+      <w:r>
+        <w:rPr>
+          <w:rFonts w:asciiTheme="minorHAnsi" w:hAnsiTheme="minorHAnsi" w:cstheme="minorHAnsi"/>
+        </w:rPr>
+        <w:t>Steinfeldt et al., 2009, Kortzinger et al., 2008, Smithie et al, 2008</w:t>
+      </w:r>
+      <w:r>
+        <w:rPr>
+          <w:rFonts w:asciiTheme="minorHAnsi" w:hAnsiTheme="minorHAnsi" w:cstheme="minorHAnsi"/>
+        </w:rPr>
+        <w:t xml:space="preserve">).  </w:t>
+      </w:r>
+      <w:r>
+        <w:rPr>
+          <w:rFonts w:asciiTheme="minorHAnsi" w:hAnsiTheme="minorHAnsi" w:cstheme="minorHAnsi"/>
+        </w:rPr>
+        <w:t xml:space="preserve">Deep convection also transports nutrients from the ocean interior to the surface, leading to large phytoplankton blooms, as observed in 2015 and 2022 (Devred et al., 2025).    </w:t>
+      </w:r>
+    </w:p>
+    <w:p>
+      <w:pPr>
+        <w:rPr>
+          <w:rFonts w:asciiTheme="minorHAnsi" w:hAnsiTheme="minorHAnsi" w:cstheme="minorHAnsi"/>
+        </w:rPr>
+      </w:pPr>
+    </w:p>
+    <w:p>
+      <w:pPr>
+        <w:rPr>
+          <w:rFonts w:asciiTheme="minorHAnsi" w:hAnsiTheme="minorHAnsi" w:cstheme="minorHAnsi"/>
+        </w:rPr>
+      </w:pPr>
+    </w:p>
+    <w:p>
+      <w:pPr>
+        <w:rPr>
+          <w:rFonts w:asciiTheme="minorHAnsi" w:hAnsiTheme="minorHAnsi" w:cstheme="minorHAnsi"/>
+        </w:rPr>
+      </w:pPr>
+      <w:r>
+        <w:rPr>
+          <w:rFonts w:asciiTheme="minorHAnsi" w:hAnsiTheme="minorHAnsi" w:cstheme="minorHAnsi"/>
+        </w:rPr>
+        <w:t>1.1 History of convection in the Labrador sea</w:t>
+      </w:r>
+    </w:p>
+    <w:p>
+      <w:pPr>
+        <w:rPr>
+          <w:rFonts w:asciiTheme="minorHAnsi" w:hAnsiTheme="minorHAnsi" w:cstheme="minorHAnsi"/>
+        </w:rPr>
+      </w:pPr>
+      <w:r>
+        <w:rPr>
+          <w:rFonts w:asciiTheme="minorHAnsi" w:hAnsiTheme="minorHAnsi" w:cstheme="minorHAnsi"/>
+        </w:rPr>
+        <w:t>Deep convection is initiated by high heat loss from the ocean’s surface which weakens or erases the density stratification in the water column.  This event is mainly associated with a positive North Atlantic Oscillation index  (need a ref.).  During a positive NAO, the atmosphere over the labrador sea is colder than average and experiences stronger winds,  the ocean responds with an increase in heat flux from the ocean to the atmosphere and therefore increasing the density in the surface of the labrador sea which loses its high surface buoyance and begins to sink.  The convection depth has been well known for the past 70 years.  One of the first reports of deep convection was observed by Lazier (1980) where relatively warm and salty labrador sea water was abruptly changed with the severe winter of 1972/73 which produced mixed layers deeper than 1500 meters.  This new labrador sea water was cooler and fresher as it had now incorporated fresher, less saline surface waters into its interior (Lazer, 1980, Yashayaev 2007).   During the late 80s and early 90s there was another event observed that formed one of the deepest, densest and most volume of labrador sea water.  In 1990, the convection depth was  approximately 2100 meters and increased to 2300 meters by the spring of 1993 (Yashayaev et al., 2000, Yashayaev 2007).  However, from 1994 onward, cold water input gradually weakened convection until 2000, when convection again strengthened, reaching depths between 500 m and 1000 m. During this time, only the upper Labrador Sea Water (LSW) was ventilated (1997–2005), with a large decrease in formation rates from 8 Sv in 1997/99 to less than 1 Sv (1Sv = 10</w:t>
+      </w:r>
+      <w:r>
+        <w:rPr>
+          <w:rFonts w:asciiTheme="minorHAnsi" w:hAnsiTheme="minorHAnsi" w:cstheme="minorHAnsi"/>
           <w:vertAlign w:val="superscript"/>
         </w:rPr>
-        <w:t>12</w:t>
-      </w:r>
-      <w:r>
-        <w:rPr>
-          <w:rFonts w:ascii="Calibri" w:hAnsi="Calibri" w:cs="Calibri"/>
-        </w:rPr>
-        <w:t xml:space="preserve"> moles of 02 per year were exported from the Labrador sea through the</w:t>
-      </w:r>
-      <w:r>
-        <w:rPr>
-          <w:rFonts w:ascii="Calibri" w:hAnsi="Calibri" w:cs="Calibri"/>
-        </w:rPr>
-        <w:t xml:space="preserve"> deep western boundary current (</w:t>
-      </w:r>
-      <w:r>
-        <w:rPr>
-          <w:rFonts w:ascii="Calibri" w:hAnsi="Calibri" w:cs="Calibri"/>
-        </w:rPr>
-        <w:t>DWBC</w:t>
-      </w:r>
-      <w:r>
-        <w:rPr>
-          <w:rFonts w:ascii="Calibri" w:hAnsi="Calibri" w:cs="Calibri"/>
-        </w:rPr>
-        <w:t>)</w:t>
-      </w:r>
-      <w:r>
-        <w:rPr>
-          <w:rFonts w:ascii="Calibri" w:hAnsi="Calibri" w:cs="Calibri"/>
-        </w:rPr>
-        <w:t xml:space="preserve"> which was 50% of the wintertime uptake.  </w:t>
-      </w:r>
-      <w:r>
-        <w:rPr>
-          <w:rFonts w:ascii="Calibri" w:hAnsi="Calibri" w:cs="Calibri"/>
-        </w:rPr>
-        <w:t xml:space="preserve">Deep convection also transports nutrients from the ocean interior to the surface, leading to large phytoplankton blooms, as observed in 2015 and 2022 (Devred et al., 2025).    </w:t>
-      </w:r>
-    </w:p>
-    <w:p>
-      <w:pPr>
-        <w:rPr>
-          <w:rFonts w:ascii="Calibri" w:hAnsi="Calibri" w:cs="Calibri"/>
-        </w:rPr>
-      </w:pPr>
-    </w:p>
-    <w:p>
-      <w:pPr>
-        <w:rPr>
-          <w:rFonts w:ascii="Calibri" w:hAnsi="Calibri" w:cs="Calibri"/>
-        </w:rPr>
-      </w:pPr>
-      <w:r>
-        <w:rPr>
-          <w:rFonts w:ascii="Calibri" w:hAnsi="Calibri" w:cs="Calibri"/>
-        </w:rPr>
-        <w:t>1.1 History of convection in the Labrador sea</w:t>
-      </w:r>
-    </w:p>
-    <w:p>
-      <w:pPr>
-        <w:rPr>
-          <w:rFonts w:ascii="Calibri" w:hAnsi="Calibri" w:cs="Calibri"/>
-        </w:rPr>
-      </w:pPr>
-      <w:r>
-        <w:rPr>
-          <w:rFonts w:ascii="Calibri" w:hAnsi="Calibri" w:cs="Calibri"/>
-        </w:rPr>
-        <w:t xml:space="preserve">Deep convection is initiated by </w:t>
-      </w:r>
-      <w:r>
-        <w:rPr>
-          <w:rFonts w:ascii="Calibri" w:hAnsi="Calibri" w:cs="Calibri"/>
-        </w:rPr>
-        <w:t>high</w:t>
-      </w:r>
-      <w:r>
-        <w:rPr>
-          <w:rFonts w:ascii="Calibri" w:hAnsi="Calibri" w:cs="Calibri"/>
-        </w:rPr>
-        <w:t xml:space="preserve"> heat loss from the ocean’s surface</w:t>
-      </w:r>
-      <w:r>
-        <w:rPr>
-          <w:rFonts w:ascii="Calibri" w:hAnsi="Calibri" w:cs="Calibri"/>
-        </w:rPr>
-        <w:t xml:space="preserve"> which weakens or erases the density stratification in the water column.  This event is </w:t>
-      </w:r>
-      <w:r>
-        <w:rPr>
-          <w:rFonts w:ascii="Calibri" w:hAnsi="Calibri" w:cs="Calibri"/>
-        </w:rPr>
-        <w:t>mainly associated with a positive North Atlantic Oscillation index</w:t>
-      </w:r>
-      <w:r>
-        <w:rPr>
-          <w:rFonts w:ascii="Calibri" w:hAnsi="Calibri" w:cs="Calibri"/>
-        </w:rPr>
-        <w:t xml:space="preserve">  (need a ref.)</w:t>
-      </w:r>
-      <w:r>
-        <w:rPr>
-          <w:rFonts w:ascii="Calibri" w:hAnsi="Calibri" w:cs="Calibri"/>
-        </w:rPr>
-        <w:t>.  During a positive NAO</w:t>
-      </w:r>
-      <w:r>
-        <w:rPr>
-          <w:rFonts w:ascii="Calibri" w:hAnsi="Calibri" w:cs="Calibri"/>
-        </w:rPr>
-        <w:t xml:space="preserve">, the atmosphere over the labrador sea is colder than average and experiences stronger winds,  </w:t>
-      </w:r>
-      <w:r>
-        <w:rPr>
-          <w:rFonts w:ascii="Calibri" w:hAnsi="Calibri" w:cs="Calibri"/>
-        </w:rPr>
-        <w:t xml:space="preserve">the ocean responds with an increase in heat flux from the ocean to the atmosphere and therefore increasing </w:t>
-      </w:r>
-      <w:r>
-        <w:rPr>
-          <w:rFonts w:ascii="Calibri" w:hAnsi="Calibri" w:cs="Calibri"/>
-        </w:rPr>
-        <w:t xml:space="preserve">the </w:t>
-      </w:r>
-      <w:r>
-        <w:rPr>
-          <w:rFonts w:ascii="Calibri" w:hAnsi="Calibri" w:cs="Calibri"/>
-        </w:rPr>
-        <w:t>density</w:t>
-      </w:r>
-      <w:r>
-        <w:rPr>
-          <w:rFonts w:ascii="Calibri" w:hAnsi="Calibri" w:cs="Calibri"/>
-        </w:rPr>
-        <w:t xml:space="preserve"> in the surface of the labrador sea which </w:t>
-      </w:r>
-      <w:proofErr w:type="spellStart"/>
-      <w:r>
-        <w:rPr>
-          <w:rFonts w:ascii="Calibri" w:hAnsi="Calibri" w:cs="Calibri"/>
-        </w:rPr>
-        <w:t>looses</w:t>
-      </w:r>
-      <w:proofErr w:type="spellEnd"/>
-      <w:r>
-        <w:rPr>
-          <w:rFonts w:ascii="Calibri" w:hAnsi="Calibri" w:cs="Calibri"/>
-        </w:rPr>
-        <w:t xml:space="preserve"> its high surface buoyance and begins to sink.  The convection depth has been well known for the past 70 years.  </w:t>
-      </w:r>
-      <w:r>
-        <w:rPr>
-          <w:rFonts w:ascii="Calibri" w:hAnsi="Calibri" w:cs="Calibri"/>
-        </w:rPr>
-        <w:t>One of the first reports of deep convection was observed by Lazier</w:t>
-      </w:r>
-      <w:r>
-        <w:rPr>
-          <w:rFonts w:ascii="Calibri" w:hAnsi="Calibri" w:cs="Calibri"/>
-        </w:rPr>
-        <w:t xml:space="preserve"> (</w:t>
-      </w:r>
-      <w:r>
-        <w:rPr>
-          <w:rFonts w:ascii="Calibri" w:hAnsi="Calibri" w:cs="Calibri"/>
-        </w:rPr>
-        <w:t>1980</w:t>
-      </w:r>
-      <w:r>
-        <w:rPr>
-          <w:rFonts w:ascii="Calibri" w:hAnsi="Calibri" w:cs="Calibri"/>
-        </w:rPr>
-        <w:t>)</w:t>
-      </w:r>
-      <w:r>
-        <w:rPr>
-          <w:rFonts w:ascii="Calibri" w:hAnsi="Calibri" w:cs="Calibri"/>
-        </w:rPr>
-        <w:t xml:space="preserve"> where relatively warm and salty labrador sea water was abruptly changed with the severe winter of 1972/73 which produced mixed layers deeper than 1500</w:t>
-      </w:r>
-      <w:r>
-        <w:rPr>
-          <w:rFonts w:ascii="Calibri" w:hAnsi="Calibri" w:cs="Calibri"/>
-        </w:rPr>
-        <w:t xml:space="preserve"> meters</w:t>
-      </w:r>
-      <w:r>
-        <w:rPr>
-          <w:rFonts w:ascii="Calibri" w:hAnsi="Calibri" w:cs="Calibri"/>
-        </w:rPr>
-        <w:t>.  This new labrador sea water was cooler and fresher as it had now incorporated fresher, less saline surface waters into its interior (Lazer, 1980, Yashayaev 2007).   During the late 80s and early 90s there was another event observed that formed one of the deepest, densest and most volume of labrador sea water.  In 1990</w:t>
-      </w:r>
-      <w:r>
-        <w:rPr>
-          <w:rFonts w:ascii="Calibri" w:hAnsi="Calibri" w:cs="Calibri"/>
-        </w:rPr>
-        <w:t>,</w:t>
-      </w:r>
-      <w:r>
-        <w:rPr>
-          <w:rFonts w:ascii="Calibri" w:hAnsi="Calibri" w:cs="Calibri"/>
-        </w:rPr>
-        <w:t xml:space="preserve"> the convection depth was  approximately 2100 meters and increased to 2300 meters by the spring of 1993 (Yashayaev et al., 2000, Yashayaev 2007).  However, from 1994 onward, cold water input gradually weakened convection until 2000, when convection again strengthened, reaching depths between 500 m and 1000 m. During this time, only the upper Labrador Sea Water (LSW) was ventilated (1997–2005), with a large decrease in formation rates from 8 </w:t>
-      </w:r>
-      <w:proofErr w:type="spellStart"/>
-      <w:r>
-        <w:rPr>
-          <w:rFonts w:ascii="Calibri" w:hAnsi="Calibri" w:cs="Calibri"/>
-        </w:rPr>
-        <w:t>Sv</w:t>
-      </w:r>
-      <w:proofErr w:type="spellEnd"/>
-      <w:r>
-        <w:rPr>
-          <w:rFonts w:ascii="Calibri" w:hAnsi="Calibri" w:cs="Calibri"/>
-        </w:rPr>
-        <w:t xml:space="preserve"> in 1997/99 to less than 1 </w:t>
-      </w:r>
-      <w:proofErr w:type="spellStart"/>
-      <w:r>
-        <w:rPr>
-          <w:rFonts w:ascii="Calibri" w:hAnsi="Calibri" w:cs="Calibri"/>
-        </w:rPr>
-        <w:t>Sv</w:t>
-      </w:r>
-      <w:proofErr w:type="spellEnd"/>
-      <w:r>
-        <w:rPr>
-          <w:rFonts w:ascii="Calibri" w:hAnsi="Calibri" w:cs="Calibri"/>
-        </w:rPr>
-        <w:t xml:space="preserve"> (1Sv = 10</w:t>
-      </w:r>
-      <w:r>
-        <w:rPr>
-          <w:rFonts w:ascii="Calibri" w:hAnsi="Calibri" w:cs="Calibri"/>
+        <w:t>6</w:t>
+      </w:r>
+      <w:r>
+        <w:rPr>
+          <w:rFonts w:asciiTheme="minorHAnsi" w:hAnsiTheme="minorHAnsi" w:cstheme="minorHAnsi"/>
+        </w:rPr>
+        <w:t xml:space="preserve"> m</w:t>
+      </w:r>
+      <w:r>
+        <w:rPr>
+          <w:rFonts w:asciiTheme="minorHAnsi" w:hAnsiTheme="minorHAnsi" w:cstheme="minorHAnsi"/>
           <w:vertAlign w:val="superscript"/>
         </w:rPr>
-        <w:t>6</w:t>
-      </w:r>
-      <w:r>
-        <w:rPr>
-          <w:rFonts w:ascii="Calibri" w:hAnsi="Calibri" w:cs="Calibri"/>
-        </w:rPr>
-        <w:t xml:space="preserve"> m</w:t>
-      </w:r>
-      <w:r>
-        <w:rPr>
-          <w:rFonts w:ascii="Calibri" w:hAnsi="Calibri" w:cs="Calibri"/>
+        <w:t xml:space="preserve">3 </w:t>
+      </w:r>
+      <w:r>
+        <w:rPr>
+          <w:rFonts w:asciiTheme="minorHAnsi" w:hAnsiTheme="minorHAnsi" w:cstheme="minorHAnsi"/>
+        </w:rPr>
+        <w:t>s</w:t>
+      </w:r>
+      <w:r>
+        <w:rPr>
+          <w:rFonts w:asciiTheme="minorHAnsi" w:hAnsiTheme="minorHAnsi" w:cstheme="minorHAnsi"/>
           <w:vertAlign w:val="superscript"/>
         </w:rPr>
-        <w:t xml:space="preserve">3 </w:t>
-      </w:r>
-      <w:r>
-        <w:rPr>
-          <w:rFonts w:ascii="Calibri" w:hAnsi="Calibri" w:cs="Calibri"/>
-        </w:rPr>
-        <w:t>s</w:t>
-      </w:r>
-      <w:r>
-        <w:rPr>
-          <w:rFonts w:ascii="Calibri" w:hAnsi="Calibri" w:cs="Calibri"/>
-          <w:vertAlign w:val="superscript"/>
-        </w:rPr>
         <w:t>-1</w:t>
       </w:r>
       <w:r>
         <w:rPr>
-          <w:rFonts w:ascii="Calibri" w:hAnsi="Calibri" w:cs="Calibri"/>
+          <w:rFonts w:asciiTheme="minorHAnsi" w:hAnsiTheme="minorHAnsi" w:cstheme="minorHAnsi"/>
         </w:rPr>
         <w:t xml:space="preserve">) in 2003/05 (Rhein et al., 2011). In 2008, winter convection reached 1600 meters, with water densities that hadn't been ventilated since 1994. While subsequent years saw shallower convection around 1000 meters, the winters of 2013/14 and especially 2014/15 saw a resurgence in deep convection (&gt;2100 meters), bringing LSW properties similar to those seen in the 1990s and volumes greater than in 2008 (Rhein et al., 2017).  Recent data from Yashayaev (2024) highlight developments in the Labrador sea from 2012 to 2023. A particularly dense and cold water mass appeared in 2018 between 700 m and 2000 meters, marking the coldest and densest conditions since 1995. Convection deepened again to 1600 meters in 2020, cooling the 200–2000 m layer. </w:t>
       </w:r>
       <w:r>
         <w:rPr>
-          <w:rFonts w:ascii="Calibri" w:hAnsi="Calibri" w:cs="Calibri"/>
+          <w:rFonts w:asciiTheme="minorHAnsi" w:hAnsiTheme="minorHAnsi" w:cstheme="minorHAnsi"/>
         </w:rPr>
         <w:lastRenderedPageBreak/>
-        <w:t xml:space="preserve">However, in 2021, convection shallowed to 800 meters, with warming in the intermediate upper layer and a cold LSW remnant persisting below 800 meters. Salinity decreased above 800 meters while increasing below, and record-high freshwater content was recorded between 200–800 meters. In 2022, convection deepened to between 1000 and 2000 meters, but by 2023, it weakened again to 700 meters, the shallowest it has been in 13 years, however the mixed layer remained colder than in 2021. A broader trend of freshening has been observed, with the 34.84 isohaline deepening from 150 meters in 2017 to 1000 meters by 2022. Notably, 2021, 2023, and 2011 rank among the four shallowest convection events since the mid-1980s. The weakening of convection in 2023 is attributed to ongoing </w:t>
-      </w:r>
-      <w:proofErr w:type="spellStart"/>
-      <w:r>
-        <w:rPr>
-          <w:rFonts w:ascii="Calibri" w:hAnsi="Calibri" w:cs="Calibri"/>
-        </w:rPr>
-        <w:t>seawide</w:t>
-      </w:r>
-      <w:proofErr w:type="spellEnd"/>
-      <w:r>
-        <w:rPr>
-          <w:rFonts w:ascii="Calibri" w:hAnsi="Calibri" w:cs="Calibri"/>
-        </w:rPr>
-        <w:t xml:space="preserve"> freshening (Fried et al., 2024, Wei and Zhang 2024).</w:t>
-      </w:r>
-    </w:p>
-    <w:p>
-      <w:pPr>
-        <w:rPr>
-          <w:rFonts w:ascii="Calibri" w:hAnsi="Calibri" w:cs="Calibri"/>
-        </w:rPr>
-      </w:pPr>
-    </w:p>
-    <w:p>
-      <w:pPr>
-        <w:rPr>
-          <w:rFonts w:ascii="Calibri" w:hAnsi="Calibri" w:cs="Calibri"/>
-        </w:rPr>
-      </w:pPr>
-      <w:r>
-        <w:rPr>
-          <w:rFonts w:ascii="Calibri" w:hAnsi="Calibri" w:cs="Calibri"/>
-        </w:rPr>
-        <w:t>1.2</w:t>
-      </w:r>
-      <w:r>
-        <w:rPr>
-          <w:rFonts w:ascii="Calibri" w:hAnsi="Calibri" w:cs="Calibri"/>
+        <w:t>However, in 2021, convection shallowed to 800 meters, with warming in the intermediate upper layer and a cold LSW remnant persisting below 800 meters. Salinity decreased above 800 meters while increasing below, and record-high freshwater content was recorded between 200–800 meters. In 2022, convection deepened to between 1000 and 2000 meters, but by 2023, it weakened again to 700 meters, the shallowest it has been in 13 years, however the mixed layer remained colder than in 2021. A broader trend of freshening has been observed, with the 34.84 isohaline deepening from 150 meters in 2017 to 1000 meters by 2022. Notably, 2021, 2023, and 2011 rank among the four shallowest convection events since the mid-1980s. The weakening of convection in 2023 is attributed to ongoing seawide freshening (Fried et al., 2024, Wei and Zhang 2024).</w:t>
+      </w:r>
+    </w:p>
+    <w:p>
+      <w:pPr>
+        <w:rPr>
+          <w:rFonts w:asciiTheme="minorHAnsi" w:hAnsiTheme="minorHAnsi" w:cstheme="minorHAnsi"/>
+        </w:rPr>
+      </w:pPr>
+    </w:p>
+    <w:p>
+      <w:pPr>
+        <w:rPr>
+          <w:rFonts w:asciiTheme="minorHAnsi" w:hAnsiTheme="minorHAnsi" w:cstheme="minorHAnsi"/>
+        </w:rPr>
+      </w:pPr>
+    </w:p>
+    <w:p>
+      <w:pPr>
+        <w:rPr>
+          <w:rFonts w:asciiTheme="minorHAnsi" w:hAnsiTheme="minorHAnsi" w:cstheme="minorHAnsi"/>
+        </w:rPr>
+      </w:pPr>
+      <w:r>
+        <w:rPr>
+          <w:rFonts w:asciiTheme="minorHAnsi" w:hAnsiTheme="minorHAnsi" w:cstheme="minorHAnsi"/>
+        </w:rPr>
+        <w:t>1.</w:t>
+      </w:r>
+      <w:r>
+        <w:rPr>
+          <w:rFonts w:asciiTheme="minorHAnsi" w:hAnsiTheme="minorHAnsi" w:cstheme="minorHAnsi"/>
+        </w:rPr>
+        <w:t>1</w:t>
+      </w:r>
+      <w:r>
+        <w:rPr>
+          <w:rFonts w:asciiTheme="minorHAnsi" w:hAnsiTheme="minorHAnsi" w:cstheme="minorHAnsi"/>
         </w:rPr>
         <w:t xml:space="preserve"> Transient tracers SF6 and CFCs</w:t>
       </w:r>
@@ -1878,394 +1861,149 @@
     <w:p>
       <w:pPr>
         <w:rPr>
-          <w:rFonts w:ascii="Calibri" w:hAnsi="Calibri" w:cs="Calibri"/>
-        </w:rPr>
-      </w:pPr>
-    </w:p>
-    <w:p>
-      <w:pPr>
-        <w:rPr>
-          <w:rFonts w:cstheme="minorHAnsi"/>
-        </w:rPr>
-      </w:pPr>
-      <w:r>
-        <w:rPr>
-          <w:rFonts w:cstheme="minorHAnsi"/>
-        </w:rPr>
-        <w:t xml:space="preserve">Transient tracer measurements are extremely useful when describing the ventilation of the labrador sea, water mass circulation and formation rates. </w:t>
-      </w:r>
-      <w:r>
-        <w:rPr>
-          <w:rFonts w:cstheme="minorHAnsi"/>
-        </w:rPr>
-        <w:t xml:space="preserve">Formation rates of Labrador Sea Water (LSW) have been estimated using inventories of chlorofluorocarbons (CFCs) in </w:t>
-      </w:r>
-      <w:r>
-        <w:rPr>
-          <w:rFonts w:cstheme="minorHAnsi"/>
-        </w:rPr>
-        <w:t>this</w:t>
-      </w:r>
-      <w:r>
-        <w:rPr>
-          <w:rFonts w:cstheme="minorHAnsi"/>
-        </w:rPr>
-        <w:t xml:space="preserve"> region. Rhein et al. (2002) calculated a mean formation rate of 4.4–5.6 </w:t>
-      </w:r>
-      <w:proofErr w:type="spellStart"/>
-      <w:r>
-        <w:rPr>
-          <w:rFonts w:cstheme="minorHAnsi"/>
-        </w:rPr>
-        <w:t>Sv</w:t>
-      </w:r>
-      <w:proofErr w:type="spellEnd"/>
-      <w:r>
-        <w:rPr>
-          <w:rFonts w:cstheme="minorHAnsi"/>
-        </w:rPr>
-        <w:t xml:space="preserve"> for the year 1997, while </w:t>
-      </w:r>
-      <w:proofErr w:type="spellStart"/>
-      <w:r>
-        <w:rPr>
-          <w:rFonts w:cstheme="minorHAnsi"/>
-        </w:rPr>
-        <w:t>Smethie</w:t>
-      </w:r>
-      <w:proofErr w:type="spellEnd"/>
-      <w:r>
-        <w:rPr>
-          <w:rFonts w:cstheme="minorHAnsi"/>
-        </w:rPr>
-        <w:t xml:space="preserve"> and Fine (2001) estimated the formation rate of North Atlantic Deep Water (NADW) as 17.2 </w:t>
-      </w:r>
-      <w:proofErr w:type="spellStart"/>
-      <w:r>
-        <w:rPr>
-          <w:rFonts w:cstheme="minorHAnsi"/>
-        </w:rPr>
-        <w:t>Sv</w:t>
-      </w:r>
-      <w:proofErr w:type="spellEnd"/>
-      <w:r>
-        <w:rPr>
-          <w:rFonts w:cstheme="minorHAnsi"/>
-        </w:rPr>
-        <w:t xml:space="preserve"> for the period 1986–1992, with approximately 7.4 </w:t>
-      </w:r>
-      <w:proofErr w:type="spellStart"/>
-      <w:r>
-        <w:rPr>
-          <w:rFonts w:cstheme="minorHAnsi"/>
-        </w:rPr>
-        <w:t>Sv</w:t>
-      </w:r>
-      <w:proofErr w:type="spellEnd"/>
-      <w:r>
-        <w:rPr>
-          <w:rFonts w:cstheme="minorHAnsi"/>
-        </w:rPr>
-        <w:t xml:space="preserve"> attributed to the central Labrador Sea. Kieke et al. (2006) determined a mean formation rate for the upper Labrador Sea, defined by a density range of σₜ = 27.68–27.74 kg m⁻³, of 3.2–3.3 </w:t>
-      </w:r>
-      <w:proofErr w:type="spellStart"/>
-      <w:r>
-        <w:rPr>
-          <w:rFonts w:cstheme="minorHAnsi"/>
-        </w:rPr>
-        <w:t>Sv</w:t>
-      </w:r>
-      <w:proofErr w:type="spellEnd"/>
-      <w:r>
-        <w:rPr>
-          <w:rFonts w:cstheme="minorHAnsi"/>
-        </w:rPr>
-        <w:t xml:space="preserve"> from 1970 to 1997, and a combined mean rate for both the upper Labrador Sea and the full LSW layer of 7.6–8.9 </w:t>
-      </w:r>
-      <w:proofErr w:type="spellStart"/>
-      <w:r>
-        <w:rPr>
-          <w:rFonts w:cstheme="minorHAnsi"/>
-        </w:rPr>
-        <w:t>Sv</w:t>
-      </w:r>
-      <w:proofErr w:type="spellEnd"/>
-      <w:r>
-        <w:rPr>
-          <w:rFonts w:cstheme="minorHAnsi"/>
-        </w:rPr>
-        <w:t xml:space="preserve">. By 2001, upper Labrador Sea formation had declined to 3.3–4.7 </w:t>
-      </w:r>
-      <w:proofErr w:type="spellStart"/>
-      <w:r>
-        <w:rPr>
-          <w:rFonts w:cstheme="minorHAnsi"/>
-        </w:rPr>
-        <w:t>Sv</w:t>
-      </w:r>
-      <w:proofErr w:type="spellEnd"/>
-      <w:r>
-        <w:rPr>
-          <w:rFonts w:cstheme="minorHAnsi"/>
-        </w:rPr>
-        <w:t xml:space="preserve">. In a follow-up study, Kieke et al. (2007) reported a formation rate of 7.9 </w:t>
-      </w:r>
-      <w:proofErr w:type="spellStart"/>
-      <w:r>
-        <w:rPr>
-          <w:rFonts w:cstheme="minorHAnsi"/>
-        </w:rPr>
-        <w:t>Sv</w:t>
-      </w:r>
-      <w:proofErr w:type="spellEnd"/>
-      <w:r>
-        <w:rPr>
-          <w:rFonts w:cstheme="minorHAnsi"/>
-        </w:rPr>
-        <w:t xml:space="preserve"> for 1998–1999, which dropped significantly to 2.5 </w:t>
-      </w:r>
-      <w:proofErr w:type="spellStart"/>
-      <w:r>
-        <w:rPr>
-          <w:rFonts w:cstheme="minorHAnsi"/>
-        </w:rPr>
-        <w:t>Sv</w:t>
-      </w:r>
-      <w:proofErr w:type="spellEnd"/>
-      <w:r>
-        <w:rPr>
-          <w:rFonts w:cstheme="minorHAnsi"/>
-        </w:rPr>
-        <w:t xml:space="preserve"> in 2000</w:t>
-      </w:r>
-      <w:r>
-        <w:rPr>
-          <w:rFonts w:cstheme="minorHAnsi"/>
-        </w:rPr>
-        <w:t xml:space="preserve">.  These rates are highly variable and further </w:t>
-      </w:r>
-      <w:r>
-        <w:rPr>
-          <w:rFonts w:cstheme="minorHAnsi"/>
-        </w:rPr>
-        <w:t>highlight</w:t>
-      </w:r>
-      <w:r>
-        <w:rPr>
-          <w:rFonts w:cstheme="minorHAnsi"/>
-        </w:rPr>
-        <w:t>s</w:t>
-      </w:r>
-      <w:r>
-        <w:rPr>
-          <w:rFonts w:cstheme="minorHAnsi"/>
-        </w:rPr>
-        <w:t xml:space="preserve"> the interannual variability of LSW formation.</w:t>
-      </w:r>
-      <w:r>
-        <w:rPr>
-          <w:rFonts w:cstheme="minorHAnsi"/>
-        </w:rPr>
-        <w:t xml:space="preserve">  </w:t>
-      </w:r>
-    </w:p>
-    <w:p>
-      <w:pPr>
-        <w:rPr>
-          <w:rFonts w:cstheme="minorHAnsi"/>
-        </w:rPr>
-      </w:pPr>
-      <w:r>
-        <w:rPr>
-          <w:rFonts w:cstheme="minorHAnsi"/>
+          <w:rFonts w:asciiTheme="minorHAnsi" w:hAnsiTheme="minorHAnsi" w:cstheme="minorHAnsi"/>
+        </w:rPr>
+      </w:pPr>
+    </w:p>
+    <w:p>
+      <w:pPr>
+        <w:rPr>
+          <w:rFonts w:asciiTheme="minorHAnsi" w:hAnsiTheme="minorHAnsi" w:cstheme="minorHAnsi"/>
+        </w:rPr>
+      </w:pPr>
+      <w:r>
+        <w:rPr>
+          <w:rFonts w:asciiTheme="minorHAnsi" w:hAnsiTheme="minorHAnsi" w:cstheme="minorHAnsi"/>
+        </w:rPr>
+        <w:t xml:space="preserve">Transient tracer measurements are extremely useful when describing the ventilation of the labrador sea, water mass circulation and formation rates. Formation rates of Labrador Sea Water (LSW) have been estimated using inventories of chlorofluorocarbons (CFCs) in this region. Rhein et al. (2002) calculated a mean formation rate of 4.4–5.6 Sv for the year 1997, while Smethie and Fine (2001) estimated the formation rate of North Atlantic Deep Water (NADW) as 17.2 Sv for the period 1986–1992, with approximately 7.4 Sv attributed to the central Labrador Sea. Kieke et al. (2006) determined a mean formation rate for the upper Labrador Sea, defined by a density range of σₜ = 27.68–27.74 kg m⁻³, of 3.2–3.3 Sv from 1970 to 1997, and a combined mean rate for both the upper Labrador Sea and the full LSW layer of 7.6–8.9 Sv. By 2001, upper Labrador Sea formation had declined to 3.3–4.7 Sv. In a follow-up study, Kieke et al. (2007) reported a formation rate of 7.9 Sv for 1998–1999, which dropped significantly to 2.5 Sv in 2000.  These rates are highly variable and further highlights the interannual variability of LSW formation.  </w:t>
+      </w:r>
+    </w:p>
+    <w:p>
+      <w:pPr>
+        <w:rPr>
+          <w:rFonts w:asciiTheme="minorHAnsi" w:hAnsiTheme="minorHAnsi" w:cstheme="minorHAnsi"/>
+        </w:rPr>
+      </w:pPr>
+      <w:r>
+        <w:rPr>
+          <w:rFonts w:asciiTheme="minorHAnsi" w:hAnsiTheme="minorHAnsi" w:cstheme="minorHAnsi"/>
         </w:rPr>
         <w:t xml:space="preserve">CFCs have been used to track pathways of LSW once it has been formed through deep convection.  This has been important as both the LSW and DSOW are key components in the Atlantic Meridional Overturning Circulation (AMOC) which plays an important role in transporting heat and carbon.  Variations in the formation and export of LSW can </w:t>
       </w:r>
-      <w:proofErr w:type="spellStart"/>
-      <w:r>
-        <w:rPr>
-          <w:rFonts w:cstheme="minorHAnsi"/>
-        </w:rPr>
-        <w:t>influcene</w:t>
-      </w:r>
-      <w:proofErr w:type="spellEnd"/>
-      <w:r>
-        <w:rPr>
-          <w:rFonts w:cstheme="minorHAnsi"/>
-        </w:rPr>
-        <w:t xml:space="preserve"> the strength and stability of the AMOC.  CFCs were first measured in the deep western bound current along the equator by Weiss et al., 1985 and they  estimated that it took 23 years to reach the tropics from the labrador sea.   </w:t>
-      </w:r>
-      <w:proofErr w:type="spellStart"/>
-      <w:r>
-        <w:rPr>
-          <w:rFonts w:cstheme="minorHAnsi"/>
-        </w:rPr>
-        <w:t>Smethie</w:t>
-      </w:r>
-      <w:proofErr w:type="spellEnd"/>
-      <w:r>
-        <w:rPr>
-          <w:rFonts w:cstheme="minorHAnsi"/>
-        </w:rPr>
-        <w:t xml:space="preserve"> et al., 2000 showed that LSW rich with CFCs was exported from the labrador sea through small eddies that became rapidly entrained into the deep western boundary current (DWBC).   These authors also calculated that it took ULSW 25-30 years to spread from the subpolar source region to the tropics.   Recently, Rhein et al., 2015 used a 25 year data set of CFCs to further observations relating to export pathways from the Labrador sea.  It was found that the decay of the CFC signal in LSW at 20N was only 39% and this was due to mixing and dispersion of source water.</w:t>
-      </w:r>
-    </w:p>
-    <w:p>
-      <w:pPr>
-        <w:rPr>
-          <w:rFonts w:ascii="Calibri" w:hAnsi="Calibri" w:cs="Calibri"/>
-        </w:rPr>
-      </w:pPr>
-    </w:p>
-    <w:p>
-      <w:proofErr w:type="spellStart"/>
-      <w:r>
-        <w:t>Chloroflurorocarbon</w:t>
-      </w:r>
-      <w:proofErr w:type="spellEnd"/>
-      <w:r>
-        <w:t xml:space="preserve"> (CFCs) and sulfur </w:t>
-      </w:r>
-      <w:proofErr w:type="spellStart"/>
-      <w:r>
-        <w:t>hexafluroide</w:t>
-      </w:r>
-      <w:proofErr w:type="spellEnd"/>
-      <w:r>
-        <w:t xml:space="preserve"> (SF6) are </w:t>
-      </w:r>
-      <w:proofErr w:type="spellStart"/>
-      <w:r>
-        <w:t>man made</w:t>
-      </w:r>
-      <w:proofErr w:type="spellEnd"/>
-      <w:r>
-        <w:t xml:space="preserve"> gases that are released to the atmosphere and dissolve into the ocean’s surface waters.  These inert compounds have been widely used as transient tracers, which help describe the fluid dynamics of the ocean.  The atmospheric mixing ratio of CFCs has increased steadily throughout the twentieth century.  However, as CFCs have been found harmful to the ozone layer the Montreal Protocol placed a ban on commercial production of many CFCs in 1988.  Since then, attention has been directed to SF6 as its atmospheric mixing ratio has increased steeply since the mid-1960s.  CFCs are useful as transient tracers on longer time scales (decadal to century) as they continue to propagate into the deep ocean interior.  SF6 was introduced into the atmosphere later than CFCs but is useful for dating recently ventilated waters.   CFCs have been a standard parameter measure on large scale hydrographic oceanography cruises (i.e. WOCE/CLIVAR/GO-SHIP) and SF6 has been becoming a standard variable to measure with CFCs on hydrographic cruises.  </w:t>
-      </w:r>
-    </w:p>
-    <w:p/>
-    <w:p>
-      <w:pPr>
-        <w:rPr>
-          <w:rFonts w:ascii="Calibri" w:hAnsi="Calibri" w:cs="Calibri"/>
-        </w:rPr>
-      </w:pPr>
-    </w:p>
-    <w:p>
-      <w:pPr>
-        <w:rPr>
-          <w:rFonts w:ascii="Calibri" w:hAnsi="Calibri" w:cs="Calibri"/>
-        </w:rPr>
-      </w:pPr>
-      <w:r>
-        <w:rPr>
-          <w:rFonts w:ascii="Calibri" w:hAnsi="Calibri" w:cs="Calibri"/>
-        </w:rPr>
-        <w:t xml:space="preserve">Tracer measurements have been used as a proxy to calculate anthropogenic carbon uptake in the oceans using the Time Transient distribution, most recently this method has been modified to take into account the varying surface saturations of CFC12 and sf6 (Raimondi et al., 2021).  These researchers calculated </w:t>
-      </w:r>
-      <w:proofErr w:type="spellStart"/>
-      <w:r>
-        <w:rPr>
-          <w:rFonts w:ascii="Calibri" w:hAnsi="Calibri" w:cs="Calibri"/>
-        </w:rPr>
-        <w:t>a</w:t>
-      </w:r>
-      <w:proofErr w:type="spellEnd"/>
-      <w:r>
-        <w:rPr>
-          <w:rFonts w:ascii="Calibri" w:hAnsi="Calibri" w:cs="Calibri"/>
-        </w:rPr>
-        <w:t xml:space="preserve"> overall increase in anthropogenic carbon in the central labrador sea of 69 mol per m2 from 1986 to 2016 (storage rate of 1.8mol m-2 y-1).  Further stating that this was not a steady rate of increase as the accumulation of Cant slowed between 2003 and 2012 (0.6 mol m-2 y-1) and increased in 2013-2016 when convection was deep (5.2 mol m-2 y-1).</w:t>
-      </w:r>
-    </w:p>
-    <w:p>
-      <w:pPr>
-        <w:rPr>
-          <w:rFonts w:ascii="Calibri" w:hAnsi="Calibri" w:cs="Calibri"/>
-        </w:rPr>
-      </w:pPr>
-      <w:r>
-        <w:rPr>
-          <w:rFonts w:ascii="Calibri" w:hAnsi="Calibri" w:cs="Calibri"/>
-        </w:rPr>
-        <w:t xml:space="preserve">The time transient distribution method calculates how long a parcel of water has been isolated from the atmosphere.  Instead of  a single age, the method calculates a range of ages described by the inverse </w:t>
-      </w:r>
-      <w:proofErr w:type="spellStart"/>
-      <w:r>
-        <w:rPr>
-          <w:rFonts w:ascii="Calibri" w:hAnsi="Calibri" w:cs="Calibri"/>
-        </w:rPr>
-        <w:t>gausian</w:t>
-      </w:r>
-      <w:proofErr w:type="spellEnd"/>
-      <w:r>
-        <w:rPr>
-          <w:rFonts w:ascii="Calibri" w:hAnsi="Calibri" w:cs="Calibri"/>
-        </w:rPr>
-        <w:t xml:space="preserve"> </w:t>
-      </w:r>
-      <w:r>
-        <w:rPr>
-          <w:rFonts w:ascii="Calibri" w:hAnsi="Calibri" w:cs="Calibri"/>
+      <w:r>
+        <w:rPr>
+          <w:rFonts w:asciiTheme="minorHAnsi" w:hAnsiTheme="minorHAnsi" w:cstheme="minorHAnsi"/>
+        </w:rPr>
+        <w:t>influence</w:t>
+      </w:r>
+      <w:r>
+        <w:rPr>
+          <w:rFonts w:asciiTheme="minorHAnsi" w:hAnsiTheme="minorHAnsi" w:cstheme="minorHAnsi"/>
+        </w:rPr>
+        <w:t xml:space="preserve"> the strength and stability of the AMOC.  CFCs were first measured in the deep western bound current along the equator by Weiss et al., 1985 and they  estimated that it took 23 years to reach the tropics from the labrador sea.   Smethie et al., 2000 showed that LSW rich with CFCs was exported from the labrador sea through small eddies that became rapidly entrained into the deep western boundary current (DWBC).   These authors also calculated that it took ULSW 25-30 years to spread from the subpolar source region to the tropics.   Recently, Rhein et al., 2015 used a 25 year data set of CFCs to further observations relating to export pathways from the Labrador sea.  It was found that the decay of the CFC signal in LSW at 20N was only 39% and this was due to mixing and dispersion of source water.</w:t>
+      </w:r>
+    </w:p>
+    <w:p>
+      <w:pPr>
+        <w:rPr>
+          <w:rFonts w:asciiTheme="minorHAnsi" w:hAnsiTheme="minorHAnsi" w:cstheme="minorHAnsi"/>
+        </w:rPr>
+      </w:pPr>
+    </w:p>
+    <w:p>
+      <w:pPr>
+        <w:rPr>
+          <w:rFonts w:asciiTheme="minorHAnsi" w:hAnsiTheme="minorHAnsi" w:cstheme="minorHAnsi"/>
+        </w:rPr>
+      </w:pPr>
+      <w:r>
+        <w:rPr>
+          <w:rFonts w:asciiTheme="minorHAnsi" w:hAnsiTheme="minorHAnsi" w:cstheme="minorHAnsi"/>
+        </w:rPr>
+        <w:t xml:space="preserve">Chloroflurorocarbon (CFCs) and sulfur hexafluroide (SF6) are man made gases that are released to the atmosphere and dissolve into the ocean’s surface waters.  These inert compounds have been widely used as transient tracers, which help describe the fluid dynamics of the ocean.  The atmospheric mixing ratio of CFCs has increased steadily throughout the twentieth century.  However, as CFCs have been found harmful to the ozone layer the Montreal Protocol placed a ban on commercial production of many CFCs in 1988.  Since then, attention has been directed to SF6 as its atmospheric mixing ratio has increased steeply since the mid-1960s.  CFCs are useful as transient tracers on longer time scales (decadal to century) as they continue to propagate into the deep ocean interior.  SF6 was introduced into the atmosphere later than CFCs but is useful for dating recently ventilated waters.   CFCs have been a standard parameter measure on large scale hydrographic oceanography cruises (i.e. WOCE/CLIVAR/GO-SHIP) and SF6 has been becoming a standard variable to measure with CFCs on hydrographic cruises.  </w:t>
+      </w:r>
+    </w:p>
+    <w:p>
+      <w:pPr>
+        <w:rPr>
+          <w:rFonts w:asciiTheme="minorHAnsi" w:hAnsiTheme="minorHAnsi" w:cstheme="minorHAnsi"/>
+        </w:rPr>
+      </w:pPr>
+    </w:p>
+    <w:p>
+      <w:pPr>
+        <w:rPr>
+          <w:rFonts w:asciiTheme="minorHAnsi" w:hAnsiTheme="minorHAnsi" w:cstheme="minorHAnsi"/>
+        </w:rPr>
+      </w:pPr>
+    </w:p>
+    <w:p>
+      <w:pPr>
+        <w:rPr>
+          <w:rFonts w:asciiTheme="minorHAnsi" w:hAnsiTheme="minorHAnsi" w:cstheme="minorHAnsi"/>
+        </w:rPr>
+      </w:pPr>
+      <w:r>
+        <w:rPr>
+          <w:rFonts w:asciiTheme="minorHAnsi" w:hAnsiTheme="minorHAnsi" w:cstheme="minorHAnsi"/>
+        </w:rPr>
+        <w:t>Tracer measurements have been used as a proxy to calculate anthropogenic carbon uptake in the oceans using the Time Transient distribution, most recently this method has been modified to take into account the varying surface saturations of CFC12 and sf6 (Raimondi et al., 2021).  These researchers calculated a overall increase in anthropogenic carbon in the central labrador sea of 69 mol per m2 from 1986 to 2016 (storage rate of 1.8mol m-2 y-1).  Further stating that this was not a steady rate of increase as the accumulation of Cant slowed between 2003 and 2012 (0.6 mol m-2 y-1) and increased in 2013-2016 when convection was deep (5.2 mol m-2 y-1).</w:t>
+      </w:r>
+    </w:p>
+    <w:p>
+      <w:pPr>
+        <w:rPr>
+          <w:rFonts w:asciiTheme="minorHAnsi" w:hAnsiTheme="minorHAnsi" w:cstheme="minorHAnsi"/>
+        </w:rPr>
+      </w:pPr>
+      <w:r>
+        <w:rPr>
+          <w:rFonts w:asciiTheme="minorHAnsi" w:hAnsiTheme="minorHAnsi" w:cstheme="minorHAnsi"/>
         </w:rPr>
         <w:lastRenderedPageBreak/>
-        <w:t>shape which uses the mean age (Ƭ), which is the last time the parcel of water was in contact with the surface and width (∆) which is spread or how mixed the ages are in the parcel of water (</w:t>
-      </w:r>
-      <w:proofErr w:type="spellStart"/>
-      <w:r>
-        <w:rPr>
-          <w:rFonts w:ascii="Calibri" w:hAnsi="Calibri" w:cs="Calibri"/>
-        </w:rPr>
-        <w:t>haine</w:t>
-      </w:r>
-      <w:proofErr w:type="spellEnd"/>
-      <w:r>
-        <w:rPr>
-          <w:rFonts w:ascii="Calibri" w:hAnsi="Calibri" w:cs="Calibri"/>
-        </w:rPr>
-        <w:t xml:space="preserve"> and hall 2002).    </w:t>
-      </w:r>
-    </w:p>
-    <w:p>
-      <w:pPr>
-        <w:rPr>
-          <w:rFonts w:ascii="Calibri" w:hAnsi="Calibri" w:cs="Calibri"/>
-        </w:rPr>
-      </w:pPr>
-    </w:p>
-    <w:p>
-      <w:pPr>
-        <w:rPr>
-          <w:rFonts w:ascii="Calibri" w:hAnsi="Calibri" w:cs="Calibri"/>
-        </w:rPr>
-      </w:pPr>
-      <w:r>
-        <w:rPr>
-          <w:rFonts w:ascii="Calibri" w:hAnsi="Calibri" w:cs="Calibri"/>
+        <w:t xml:space="preserve">The time transient distribution method calculates how long a parcel of water has been isolated from the atmosphere.  Instead of  a single age, the method calculates a range of ages described by the inverse gausian shape which uses the mean age (Ƭ), which is the last time the parcel of water was in contact with the surface and width (∆) which is spread or how mixed the ages are in the parcel of water (haine and hall 2002).    </w:t>
+      </w:r>
+    </w:p>
+    <w:p>
+      <w:pPr>
+        <w:rPr>
+          <w:rFonts w:asciiTheme="minorHAnsi" w:hAnsiTheme="minorHAnsi" w:cstheme="minorHAnsi"/>
+        </w:rPr>
+      </w:pPr>
+    </w:p>
+    <w:p>
+      <w:pPr>
+        <w:rPr>
+          <w:rFonts w:asciiTheme="minorHAnsi" w:hAnsiTheme="minorHAnsi" w:cstheme="minorHAnsi"/>
+        </w:rPr>
+      </w:pPr>
+      <w:r>
+        <w:rPr>
+          <w:rFonts w:asciiTheme="minorHAnsi" w:hAnsiTheme="minorHAnsi" w:cstheme="minorHAnsi"/>
         </w:rPr>
         <w:t xml:space="preserve">We describe the variability of both SF6 and CFC12 concentrations in the labrador sea from the time-periods of 2015-2025 which includes a period of deep convection (2015-2022) followed by a period of shallow convection (2023-2025).   </w:t>
       </w:r>
       <w:r>
         <w:rPr>
-          <w:rFonts w:ascii="Calibri" w:hAnsi="Calibri" w:cs="Calibri"/>
+          <w:rFonts w:asciiTheme="minorHAnsi" w:hAnsiTheme="minorHAnsi" w:cstheme="minorHAnsi"/>
         </w:rPr>
         <w:t xml:space="preserve"> Using the Inverse Gaussian TTD fitting w</w:t>
       </w:r>
       <w:r>
         <w:rPr>
-          <w:rFonts w:ascii="Calibri" w:hAnsi="Calibri" w:cs="Calibri"/>
+          <w:rFonts w:asciiTheme="minorHAnsi" w:hAnsiTheme="minorHAnsi" w:cstheme="minorHAnsi"/>
         </w:rPr>
         <w:t xml:space="preserve">e will quantify </w:t>
       </w:r>
       <w:r>
         <w:rPr>
-          <w:rFonts w:ascii="Calibri" w:hAnsi="Calibri" w:cs="Calibri"/>
+          <w:rFonts w:asciiTheme="minorHAnsi" w:hAnsiTheme="minorHAnsi" w:cstheme="minorHAnsi"/>
         </w:rPr>
         <w:t xml:space="preserve">the water mass age, anthropogenic carbon uptake, and rate of oxygen consumption and suppled using the apparent oxygen utilization rage.  </w:t>
       </w:r>
       <w:r>
         <w:rPr>
-          <w:rFonts w:ascii="Calibri" w:hAnsi="Calibri" w:cs="Calibri"/>
+          <w:rFonts w:asciiTheme="minorHAnsi" w:hAnsiTheme="minorHAnsi" w:cstheme="minorHAnsi"/>
         </w:rPr>
         <w:t xml:space="preserve">We will compare these results to historical concentrations as both tracers exhibit differing atmospheric trends (i.e. decreasing and increasing mixing ratios for cfc12 and sf6 respectively).  </w:t>
       </w:r>
@@ -2273,7 +2011,7 @@
     <w:p>
       <w:pPr>
         <w:rPr>
-          <w:rFonts w:ascii="Calibri" w:hAnsi="Calibri" w:cs="Calibri"/>
+          <w:rFonts w:asciiTheme="minorHAnsi" w:hAnsiTheme="minorHAnsi" w:cstheme="minorHAnsi"/>
         </w:rPr>
       </w:pPr>
     </w:p>
@@ -2316,7 +2054,7 @@
       <w:pPr>
         <w:pStyle w:val="Compact"/>
         <w:rPr>
-          <w:rFonts w:ascii="Calibri" w:hAnsi="Calibri" w:cs="Calibri"/>
+          <w:rFonts w:cstheme="minorHAnsi"/>
           <w:color w:val="AEAAAA" w:themeColor="background2" w:themeShade="BF"/>
         </w:rPr>
       </w:pPr>
@@ -2324,86 +2062,20 @@
         <w:rPr>
           <w:rFonts w:cstheme="minorHAnsi"/>
         </w:rPr>
-        <w:t xml:space="preserve">The Labrador sea has been </w:t>
-      </w:r>
-      <w:proofErr w:type="spellStart"/>
+        <w:t xml:space="preserve">The Labrador sea has been apart of </w:t>
+      </w:r>
       <w:r>
         <w:rPr>
           <w:rFonts w:cstheme="minorHAnsi"/>
         </w:rPr>
-        <w:t>apart</w:t>
-      </w:r>
-      <w:proofErr w:type="spellEnd"/>
-      <w:r>
+        <w:t xml:space="preserve">a long term monitoring program, specifically the Atlantic Repeat Hydrography line 7 West (AR7W).   This trascect was was initially part of the WOCE (World Ocean Circulation Experiment) program and later adopted into CLIVAR and GO-SHIP.  It is one of the longest monitored hydrographic lines in north America and these missions have been conducted by the Bedford Institute of Oceanography in Canda since 1990.  The AR7W line extends 900 kilometers from Misery Point, Labrador, to Cape Desolation, Greenland (Figure xx).   Field work was conducted in the early spring to summer each year with the exception of 2017 and 2021 due to ship problems not being able to sail to the labrador sea those years.  </w:t>
+      </w:r>
+    </w:p>
+    <w:p>
+      <w:pPr>
+        <w:pStyle w:val="Compact"/>
         <w:rPr>
           <w:rFonts w:cstheme="minorHAnsi"/>
-        </w:rPr>
-        <w:t xml:space="preserve"> of </w:t>
-      </w:r>
-      <w:r>
-        <w:rPr>
-          <w:rFonts w:cstheme="minorHAnsi"/>
-        </w:rPr>
-        <w:t xml:space="preserve">a long term monitoring program, specifically the </w:t>
-      </w:r>
-      <w:r>
-        <w:rPr>
-          <w:rFonts w:ascii="Calibri" w:hAnsi="Calibri" w:cs="Calibri"/>
-        </w:rPr>
-        <w:t>Atlantic Repeat Hydrography line 7 West (AR7W)</w:t>
-      </w:r>
-      <w:r>
-        <w:rPr>
-          <w:rFonts w:ascii="Calibri" w:hAnsi="Calibri" w:cs="Calibri"/>
-        </w:rPr>
-        <w:t xml:space="preserve">.   This </w:t>
-      </w:r>
-      <w:proofErr w:type="spellStart"/>
-      <w:r>
-        <w:rPr>
-          <w:rFonts w:ascii="Calibri" w:hAnsi="Calibri" w:cs="Calibri"/>
-        </w:rPr>
-        <w:t>trascect</w:t>
-      </w:r>
-      <w:proofErr w:type="spellEnd"/>
-      <w:r>
-        <w:rPr>
-          <w:rFonts w:ascii="Calibri" w:hAnsi="Calibri" w:cs="Calibri"/>
-        </w:rPr>
-        <w:t xml:space="preserve"> was </w:t>
-      </w:r>
-      <w:proofErr w:type="spellStart"/>
-      <w:r>
-        <w:rPr>
-          <w:rFonts w:ascii="Calibri" w:hAnsi="Calibri" w:cs="Calibri"/>
-        </w:rPr>
-        <w:t>was</w:t>
-      </w:r>
-      <w:proofErr w:type="spellEnd"/>
-      <w:r>
-        <w:rPr>
-          <w:rFonts w:ascii="Calibri" w:hAnsi="Calibri" w:cs="Calibri"/>
-        </w:rPr>
-        <w:t xml:space="preserve"> initially part of the WOCE (World Ocean Circulation Experiment) program and later adopted into CLIVAR and GO-SHIP.  It is one of the longest monitored hydrographic lines in north America and these missions have been conducted by the Bedford Institute of Oceanography in Canda since 1990.  The AR7W line extends 900 kilometers from Misery Point, Labrador, to Cape Desolation, Greenland</w:t>
-      </w:r>
-      <w:r>
-        <w:rPr>
-          <w:rFonts w:ascii="Calibri" w:hAnsi="Calibri" w:cs="Calibri"/>
-        </w:rPr>
-        <w:t xml:space="preserve"> (Figure xx)</w:t>
-      </w:r>
-      <w:r>
-        <w:rPr>
-          <w:rFonts w:ascii="Calibri" w:hAnsi="Calibri" w:cs="Calibri"/>
-        </w:rPr>
-        <w:t xml:space="preserve">.   Field work was conducted in the early spring to summer each year with the exception of 2017 and 2021 due to ship problems not being able to sail to the labrador sea those years.  </w:t>
-      </w:r>
-    </w:p>
-    <w:p>
-      <w:pPr>
-        <w:pStyle w:val="Compact"/>
-        <w:rPr>
-          <w:rFonts w:ascii="Calibri" w:hAnsi="Calibri" w:cs="Calibri"/>
           <w:color w:val="AEAAAA" w:themeColor="background2" w:themeShade="BF"/>
         </w:rPr>
       </w:pPr>
@@ -2427,7 +2099,7 @@
       <w:pPr>
         <w:spacing w:after="160" w:line="259" w:lineRule="auto"/>
         <w:rPr>
-          <w:rFonts w:ascii="Calibri" w:hAnsi="Calibri"/>
+          <w:rFonts w:asciiTheme="minorHAnsi" w:hAnsiTheme="minorHAnsi" w:cstheme="minorHAnsi"/>
           <w:kern w:val="2"/>
           <w:sz w:val="22"/>
           <w:szCs w:val="22"/>
@@ -2436,71 +2108,17 @@
       </w:pPr>
       <w:r>
         <w:rPr>
-          <w:rFonts w:ascii="Calibri" w:hAnsi="Calibri" w:cs="Calibri"/>
+          <w:rFonts w:asciiTheme="minorHAnsi" w:hAnsiTheme="minorHAnsi" w:cstheme="minorHAnsi"/>
           <w:kern w:val="2"/>
           <w:sz w:val="22"/>
           <w:szCs w:val="22"/>
           <w14:ligatures w14:val="standardContextual"/>
         </w:rPr>
-        <w:t xml:space="preserve">Chlorofluorocarbon-12 (F12) and </w:t>
-      </w:r>
-      <w:proofErr w:type="spellStart"/>
-      <w:r>
-        <w:rPr>
-          <w:rFonts w:ascii="Calibri" w:hAnsi="Calibri" w:cs="Calibri"/>
-          <w:kern w:val="2"/>
-          <w:sz w:val="22"/>
-          <w:szCs w:val="22"/>
-          <w14:ligatures w14:val="standardContextual"/>
-        </w:rPr>
-        <w:t>sulphur</w:t>
-      </w:r>
-      <w:proofErr w:type="spellEnd"/>
-      <w:r>
-        <w:rPr>
-          <w:rFonts w:ascii="Calibri" w:hAnsi="Calibri" w:cs="Calibri"/>
-          <w:kern w:val="2"/>
-          <w:sz w:val="22"/>
-          <w:szCs w:val="22"/>
-          <w14:ligatures w14:val="standardContextual"/>
-        </w:rPr>
-        <w:t xml:space="preserve"> hexafluoride (sf6) were measured from s</w:t>
-      </w:r>
-      <w:r>
-        <w:rPr>
-          <w:rFonts w:ascii="Calibri" w:hAnsi="Calibri"/>
-          <w:kern w:val="2"/>
-          <w:sz w:val="22"/>
-          <w:szCs w:val="22"/>
-          <w14:ligatures w14:val="standardContextual"/>
-        </w:rPr>
-        <w:t xml:space="preserve">eawater samples from the rosette which were drawn directly into 250 mL glass syringes were then stored at ~ 4 °C for up to 12 hours prior to analysis onboard. The samples were </w:t>
-      </w:r>
-      <w:proofErr w:type="spellStart"/>
-      <w:r>
-        <w:rPr>
-          <w:rFonts w:ascii="Calibri" w:hAnsi="Calibri"/>
-          <w:kern w:val="2"/>
-          <w:sz w:val="22"/>
-          <w:szCs w:val="22"/>
-          <w14:ligatures w14:val="standardContextual"/>
-        </w:rPr>
-        <w:t>analysed</w:t>
-      </w:r>
-      <w:proofErr w:type="spellEnd"/>
-      <w:r>
-        <w:rPr>
-          <w:rFonts w:ascii="Calibri" w:hAnsi="Calibri"/>
-          <w:kern w:val="2"/>
-          <w:sz w:val="22"/>
-          <w:szCs w:val="22"/>
-          <w14:ligatures w14:val="standardContextual"/>
-        </w:rPr>
-        <w:t xml:space="preserve"> for dissolved SF</w:t>
-      </w:r>
-      <w:r>
-        <w:rPr>
-          <w:rFonts w:ascii="Calibri" w:hAnsi="Calibri"/>
+        <w:t>Chlorofluorocarbon-12 (F12) and sulphur hexafluoride (sf6) were measured from seawater samples from the rosette which were drawn directly into 250 mL glass syringes were then stored at ~ 4 °C for up to 12 hours prior to analysis onboard. The samples were analysed for dissolved SF</w:t>
+      </w:r>
+      <w:r>
+        <w:rPr>
+          <w:rFonts w:asciiTheme="minorHAnsi" w:hAnsiTheme="minorHAnsi" w:cstheme="minorHAnsi"/>
           <w:kern w:val="2"/>
           <w:sz w:val="22"/>
           <w:szCs w:val="22"/>
@@ -2511,101 +2129,13 @@
       </w:r>
       <w:r>
         <w:rPr>
-          <w:rFonts w:ascii="Calibri" w:hAnsi="Calibri"/>
+          <w:rFonts w:asciiTheme="minorHAnsi" w:hAnsiTheme="minorHAnsi" w:cstheme="minorHAnsi"/>
           <w:kern w:val="2"/>
           <w:sz w:val="22"/>
           <w:szCs w:val="22"/>
           <w14:ligatures w14:val="standardContextual"/>
         </w:rPr>
-        <w:t xml:space="preserve"> and CFC-12 according to the method described in Punshon et al., 2016.   Data quality evaluation (DQE) was </w:t>
-      </w:r>
-      <w:proofErr w:type="spellStart"/>
-      <w:r>
-        <w:rPr>
-          <w:rFonts w:ascii="Calibri" w:hAnsi="Calibri"/>
-          <w:kern w:val="2"/>
-          <w:sz w:val="22"/>
-          <w:szCs w:val="22"/>
-          <w14:ligatures w14:val="standardContextual"/>
-        </w:rPr>
-        <w:t>preformed</w:t>
-      </w:r>
-      <w:proofErr w:type="spellEnd"/>
-      <w:r>
-        <w:rPr>
-          <w:rFonts w:ascii="Calibri" w:hAnsi="Calibri"/>
-          <w:kern w:val="2"/>
-          <w:sz w:val="22"/>
-          <w:szCs w:val="22"/>
-          <w14:ligatures w14:val="standardContextual"/>
-        </w:rPr>
-        <w:t xml:space="preserve"> for the tracer data sets as outlined in </w:t>
-      </w:r>
-      <w:proofErr w:type="spellStart"/>
-      <w:r>
-        <w:rPr>
-          <w:rFonts w:ascii="Calibri" w:hAnsi="Calibri"/>
-          <w:kern w:val="2"/>
-          <w:sz w:val="22"/>
-          <w:szCs w:val="22"/>
-          <w14:ligatures w14:val="standardContextual"/>
-        </w:rPr>
-        <w:t>Bullister</w:t>
-      </w:r>
-      <w:proofErr w:type="spellEnd"/>
-      <w:r>
-        <w:rPr>
-          <w:rFonts w:ascii="Calibri" w:hAnsi="Calibri"/>
-          <w:kern w:val="2"/>
-          <w:sz w:val="22"/>
-          <w:szCs w:val="22"/>
-          <w14:ligatures w14:val="standardContextual"/>
-        </w:rPr>
-        <w:t xml:space="preserve"> and </w:t>
-      </w:r>
-      <w:proofErr w:type="spellStart"/>
-      <w:r>
-        <w:rPr>
-          <w:rFonts w:ascii="Calibri" w:hAnsi="Calibri"/>
-          <w:kern w:val="2"/>
-          <w:sz w:val="22"/>
-          <w:szCs w:val="22"/>
-          <w14:ligatures w14:val="standardContextual"/>
-        </w:rPr>
-        <w:t>Tanhua</w:t>
-      </w:r>
-      <w:proofErr w:type="spellEnd"/>
-      <w:r>
-        <w:rPr>
-          <w:rFonts w:ascii="Calibri" w:hAnsi="Calibri"/>
-          <w:kern w:val="2"/>
-          <w:sz w:val="22"/>
-          <w:szCs w:val="22"/>
-          <w14:ligatures w14:val="standardContextual"/>
-        </w:rPr>
-        <w:t xml:space="preserve"> (2010).  Analytical precision and accuracy were evaluated in the laboratory using methods described in </w:t>
-      </w:r>
-      <w:proofErr w:type="spellStart"/>
-      <w:r>
-        <w:rPr>
-          <w:rFonts w:ascii="Calibri" w:hAnsi="Calibri"/>
-          <w:kern w:val="2"/>
-          <w:sz w:val="22"/>
-          <w:szCs w:val="22"/>
-          <w14:ligatures w14:val="standardContextual"/>
-        </w:rPr>
-        <w:t>Pushon</w:t>
-      </w:r>
-      <w:proofErr w:type="spellEnd"/>
-      <w:r>
-        <w:rPr>
-          <w:rFonts w:ascii="Calibri" w:hAnsi="Calibri"/>
-          <w:kern w:val="2"/>
-          <w:sz w:val="22"/>
-          <w:szCs w:val="22"/>
-          <w14:ligatures w14:val="standardContextual"/>
-        </w:rPr>
-        <w:t xml:space="preserve"> et al., 2016.  The standard error about the mean for 3 measurements was + 2.08 % and + 0.78% for SF6 and F12 respectively.  </w:t>
+        <w:t xml:space="preserve"> and CFC-12 according to the method described in Punshon et al., 2016.   Data quality evaluation (DQE) was preformed for the tracer data sets as outlined in Bullister and Tanhua (2010).  Analytical precision and accuracy were evaluated in the laboratory using methods described in Pushon et al., 2016.  The standard error about the mean for 3 measurements was + 2.08 % and + 0.78% for SF6 and F12 respectively.  </w:t>
       </w:r>
     </w:p>
     <w:p>
@@ -2627,96 +2157,26 @@
       <w:pPr>
         <w:pStyle w:val="BodyText"/>
         <w:rPr>
-          <w:rFonts w:ascii="Calibri" w:hAnsi="Calibri" w:cs="Calibri"/>
-        </w:rPr>
-      </w:pPr>
-      <w:r>
-        <w:rPr>
-          <w:rFonts w:ascii="Calibri" w:hAnsi="Calibri" w:cs="Calibri"/>
-        </w:rPr>
-        <w:t xml:space="preserve">TTD first models G(t) using real atmospheric data and solubility constants.  By varying gamma and delta (ratio) can start obtaining modelled data in seawater and compare it to observations, the best agreement between </w:t>
-      </w:r>
-      <w:proofErr w:type="spellStart"/>
-      <w:r>
-        <w:rPr>
-          <w:rFonts w:ascii="Calibri" w:hAnsi="Calibri" w:cs="Calibri"/>
-        </w:rPr>
-        <w:t>obs</w:t>
-      </w:r>
-      <w:proofErr w:type="spellEnd"/>
-      <w:r>
-        <w:rPr>
-          <w:rFonts w:ascii="Calibri" w:hAnsi="Calibri" w:cs="Calibri"/>
-        </w:rPr>
-        <w:t xml:space="preserve"> and modelled you get gamma and delta.  This is essentially the </w:t>
-      </w:r>
-      <w:proofErr w:type="spellStart"/>
-      <w:r>
-        <w:rPr>
-          <w:rFonts w:ascii="Calibri" w:hAnsi="Calibri" w:cs="Calibri"/>
-        </w:rPr>
-        <w:t>decription</w:t>
-      </w:r>
-      <w:proofErr w:type="spellEnd"/>
-      <w:r>
-        <w:rPr>
-          <w:rFonts w:ascii="Calibri" w:hAnsi="Calibri" w:cs="Calibri"/>
-        </w:rPr>
-        <w:t xml:space="preserve"> of the propagation, </w:t>
-      </w:r>
-      <w:proofErr w:type="spellStart"/>
-      <w:r>
-        <w:rPr>
-          <w:rFonts w:ascii="Calibri" w:hAnsi="Calibri" w:cs="Calibri"/>
-        </w:rPr>
-        <w:t>i.e</w:t>
-      </w:r>
-      <w:proofErr w:type="spellEnd"/>
-      <w:r>
-        <w:rPr>
-          <w:rFonts w:ascii="Calibri" w:hAnsi="Calibri" w:cs="Calibri"/>
-        </w:rPr>
-        <w:t xml:space="preserve"> how the tracer got there.  Now we can move on with the shape of the propagation and apply it to the Cant as we now know both </w:t>
-      </w:r>
-      <w:proofErr w:type="spellStart"/>
-      <w:r>
-        <w:rPr>
-          <w:rFonts w:ascii="Calibri" w:hAnsi="Calibri" w:cs="Calibri"/>
-        </w:rPr>
-        <w:t>atmos</w:t>
-      </w:r>
-      <w:proofErr w:type="spellEnd"/>
-      <w:r>
-        <w:rPr>
-          <w:rFonts w:ascii="Calibri" w:hAnsi="Calibri" w:cs="Calibri"/>
-        </w:rPr>
-        <w:t>[</w:t>
-      </w:r>
-      <w:proofErr w:type="spellStart"/>
-      <w:r>
-        <w:rPr>
-          <w:rFonts w:ascii="Calibri" w:hAnsi="Calibri" w:cs="Calibri"/>
-        </w:rPr>
-        <w:t>heric</w:t>
-      </w:r>
-      <w:proofErr w:type="spellEnd"/>
-      <w:r>
-        <w:rPr>
-          <w:rFonts w:ascii="Calibri" w:hAnsi="Calibri" w:cs="Calibri"/>
-        </w:rPr>
-        <w:t xml:space="preserve"> measurements and how the ocean was behaving at that point.  </w:t>
+          <w:rFonts w:asciiTheme="minorHAnsi" w:hAnsiTheme="minorHAnsi" w:cstheme="minorHAnsi"/>
+        </w:rPr>
+      </w:pPr>
+      <w:r>
+        <w:rPr>
+          <w:rFonts w:asciiTheme="minorHAnsi" w:hAnsiTheme="minorHAnsi" w:cstheme="minorHAnsi"/>
+        </w:rPr>
+        <w:t xml:space="preserve">TTD first models G(t) using real atmospheric data and solubility constants.  By varying gamma and delta (ratio) can start obtaining modelled data in seawater and compare it to observations, the best agreement between obs and modelled you get gamma and delta.  This is essentially the decription of the propagation, i.e how the tracer got there.  Now we can move on with the shape of the propagation and apply it to the Cant as we now know both atmos[heric measurements and how the ocean was behaving at that point.  </w:t>
       </w:r>
     </w:p>
     <w:p>
       <w:pPr>
         <w:pStyle w:val="BodyText"/>
         <w:rPr>
-          <w:rFonts w:ascii="Calibri" w:hAnsi="Calibri" w:cs="Calibri"/>
-        </w:rPr>
-      </w:pPr>
-      <w:r>
-        <w:rPr>
-          <w:rFonts w:ascii="Calibri" w:hAnsi="Calibri" w:cs="Calibri"/>
+          <w:rFonts w:asciiTheme="minorHAnsi" w:hAnsiTheme="minorHAnsi" w:cstheme="minorHAnsi"/>
+        </w:rPr>
+      </w:pPr>
+      <w:r>
+        <w:rPr>
+          <w:rFonts w:asciiTheme="minorHAnsi" w:hAnsiTheme="minorHAnsi" w:cstheme="minorHAnsi"/>
         </w:rPr>
         <w:t>further – IG – is the crux of this as this is what describes what happened in the water depending on both delta and gamma.</w:t>
       </w:r>
@@ -2932,21 +2392,7 @@
         <w:rPr>
           <w:rFonts w:asciiTheme="minorHAnsi" w:hAnsiTheme="minorHAnsi" w:cstheme="minorHAnsi"/>
         </w:rPr>
-        <w:t>upright text (</w:t>
-      </w:r>
-      <w:proofErr w:type="spellStart"/>
-      <w:r>
-        <w:rPr>
-          <w:rFonts w:asciiTheme="minorHAnsi" w:hAnsiTheme="minorHAnsi" w:cstheme="minorHAnsi"/>
-        </w:rPr>
-        <w:t>non italics</w:t>
-      </w:r>
-      <w:proofErr w:type="spellEnd"/>
-      <w:r>
-        <w:rPr>
-          <w:rFonts w:asciiTheme="minorHAnsi" w:hAnsiTheme="minorHAnsi" w:cstheme="minorHAnsi"/>
-        </w:rPr>
-        <w:t>)</w:t>
+        <w:t>upright text (non italics)</w:t>
       </w:r>
       <w:r>
         <w:rPr>
@@ -2997,15 +2443,7 @@
             <w:rStyle w:val="Hyperlink"/>
             <w:rFonts w:asciiTheme="minorHAnsi" w:hAnsiTheme="minorHAnsi" w:cstheme="minorHAnsi"/>
           </w:rPr>
-          <w:t xml:space="preserve">Brief Style </w:t>
-        </w:r>
-        <w:proofErr w:type="spellStart"/>
-        <w:r>
-          <w:rPr>
-            <w:rStyle w:val="Hyperlink"/>
-            <w:rFonts w:asciiTheme="minorHAnsi" w:hAnsiTheme="minorHAnsi" w:cstheme="minorHAnsi"/>
-          </w:rPr>
-          <w:t>Guide</w:t>
+          <w:t>Brief Style Guide</w:t>
         </w:r>
       </w:hyperlink>
       <w:r>
@@ -3018,14 +2456,7 @@
         <w:rPr>
           <w:rFonts w:asciiTheme="minorHAnsi" w:hAnsiTheme="minorHAnsi" w:cstheme="minorHAnsi"/>
         </w:rPr>
-        <w:t>“Reference</w:t>
-      </w:r>
-      <w:proofErr w:type="spellEnd"/>
-      <w:r>
-        <w:rPr>
-          <w:rFonts w:asciiTheme="minorHAnsi" w:hAnsiTheme="minorHAnsi" w:cstheme="minorHAnsi"/>
-        </w:rPr>
-        <w:t xml:space="preserve"> Formatting.”</w:t>
+        <w:t>“Reference Formatting.”</w:t>
       </w:r>
     </w:p>
     <w:p>
@@ -3274,22 +2705,8 @@
           <w:szCs w:val="22"/>
           <w14:ligatures w14:val="standardContextual"/>
         </w:rPr>
-        <w:t xml:space="preserve">JGR </w:t>
-      </w:r>
-      <w:proofErr w:type="spellStart"/>
-      <w:r>
-        <w:rPr>
-          <w:rFonts w:asciiTheme="minorHAnsi" w:eastAsia="Aptos" w:hAnsiTheme="minorHAnsi" w:cstheme="minorHAnsi"/>
-          <w:i/>
-          <w:iCs/>
-          <w:color w:val="262626"/>
-          <w:sz w:val="22"/>
-          <w:szCs w:val="22"/>
-          <w14:ligatures w14:val="standardContextual"/>
-        </w:rPr>
-        <w:t>Biogeosciences</w:t>
-      </w:r>
-      <w:proofErr w:type="spellEnd"/>
+        <w:t>JGR Biogeosciences</w:t>
+      </w:r>
       <w:r>
         <w:rPr>
           <w:rFonts w:asciiTheme="minorHAnsi" w:eastAsia="Aptos" w:hAnsiTheme="minorHAnsi" w:cstheme="minorHAnsi"/>
@@ -3418,23 +2835,7 @@
           <w:rFonts w:eastAsia="Times New Roman" w:cstheme="minorHAnsi"/>
           <w:color w:val="262626"/>
         </w:rPr>
-        <w:t xml:space="preserve">Funding information related to the work for all authors should be entered in the form in GEMS as part of your submission. This form in GEMS uses the official </w:t>
-      </w:r>
-      <w:proofErr w:type="spellStart"/>
-      <w:r>
-        <w:rPr>
-          <w:rFonts w:eastAsia="Times New Roman" w:cstheme="minorHAnsi"/>
-          <w:color w:val="262626"/>
-        </w:rPr>
-        <w:t>Fundref</w:t>
-      </w:r>
-      <w:proofErr w:type="spellEnd"/>
-      <w:r>
-        <w:rPr>
-          <w:rFonts w:eastAsia="Times New Roman" w:cstheme="minorHAnsi"/>
-          <w:color w:val="262626"/>
-        </w:rPr>
-        <w:t xml:space="preserve"> list, which provides a link after publication that is available to funders. Any other funding information not listed in the GEMS form should be included in the acknowledgments and/or cover letter.</w:t>
+        <w:t>Funding information related to the work for all authors should be entered in the form in GEMS as part of your submission. This form in GEMS uses the official Fundref list, which provides a link after publication that is available to funders. Any other funding information not listed in the GEMS form should be included in the acknowledgments and/or cover letter.</w:t>
       </w:r>
     </w:p>
     <w:p>
@@ -4096,27 +3497,7 @@
           <w:szCs w:val="24"/>
         </w:rPr>
         <w:lastRenderedPageBreak/>
-        <w:t xml:space="preserve">Fiechter, J., &amp; </w:t>
-      </w:r>
-      <w:proofErr w:type="spellStart"/>
-      <w:r>
-        <w:rPr>
-          <w:rFonts w:asciiTheme="minorHAnsi" w:eastAsia="Times New Roman" w:hAnsiTheme="minorHAnsi" w:cstheme="minorHAnsi"/>
-          <w:color w:val="262626"/>
-          <w:sz w:val="24"/>
-          <w:szCs w:val="24"/>
-        </w:rPr>
-        <w:t>Cheresh</w:t>
-      </w:r>
-      <w:proofErr w:type="spellEnd"/>
-      <w:r>
-        <w:rPr>
-          <w:rFonts w:asciiTheme="minorHAnsi" w:eastAsia="Times New Roman" w:hAnsiTheme="minorHAnsi" w:cstheme="minorHAnsi"/>
-          <w:color w:val="262626"/>
-          <w:sz w:val="24"/>
-          <w:szCs w:val="24"/>
-        </w:rPr>
-        <w:t>, J. (2020). Physical and biogeochemical drivers of alongshore pH and oxygen variability in the California Current System (Version 7) [Dataset]. Dryad. </w:t>
+        <w:t>Fiechter, J., &amp; Cheresh, J. (2020). Physical and biogeochemical drivers of alongshore pH and oxygen variability in the California Current System (Version 7) [Dataset]. Dryad. </w:t>
       </w:r>
       <w:hyperlink r:id="rId32" w:tgtFrame="_blank" w:history="1">
         <w:r>
@@ -4182,47 +3563,7 @@
           <w:sz w:val="24"/>
           <w:szCs w:val="24"/>
         </w:rPr>
-        <w:t xml:space="preserve">Bell, S. W. (2020). </w:t>
-      </w:r>
-      <w:proofErr w:type="spellStart"/>
-      <w:r>
-        <w:rPr>
-          <w:rFonts w:asciiTheme="minorHAnsi" w:eastAsia="Times New Roman" w:hAnsiTheme="minorHAnsi" w:cstheme="minorHAnsi"/>
-          <w:color w:val="262626"/>
-          <w:sz w:val="24"/>
-          <w:szCs w:val="24"/>
-        </w:rPr>
-        <w:t>samwbell</w:t>
-      </w:r>
-      <w:proofErr w:type="spellEnd"/>
-      <w:r>
-        <w:rPr>
-          <w:rFonts w:asciiTheme="minorHAnsi" w:eastAsia="Times New Roman" w:hAnsiTheme="minorHAnsi" w:cstheme="minorHAnsi"/>
-          <w:color w:val="262626"/>
-          <w:sz w:val="24"/>
-          <w:szCs w:val="24"/>
-        </w:rPr>
-        <w:t>/</w:t>
-      </w:r>
-      <w:proofErr w:type="spellStart"/>
-      <w:r>
-        <w:rPr>
-          <w:rFonts w:asciiTheme="minorHAnsi" w:eastAsia="Times New Roman" w:hAnsiTheme="minorHAnsi" w:cstheme="minorHAnsi"/>
-          <w:color w:val="262626"/>
-          <w:sz w:val="24"/>
-          <w:szCs w:val="24"/>
-        </w:rPr>
-        <w:t>saturn_counts</w:t>
-      </w:r>
-      <w:proofErr w:type="spellEnd"/>
-      <w:r>
-        <w:rPr>
-          <w:rFonts w:asciiTheme="minorHAnsi" w:eastAsia="Times New Roman" w:hAnsiTheme="minorHAnsi" w:cstheme="minorHAnsi"/>
-          <w:color w:val="262626"/>
-          <w:sz w:val="24"/>
-          <w:szCs w:val="24"/>
-        </w:rPr>
-        <w:t>: April 26, 2020 Release (Version 1.1.0) [Software]. Zenodo. </w:t>
+        <w:t>Bell, S. W. (2020). samwbell/saturn_counts: April 26, 2020 Release (Version 1.1.0) [Software]. Zenodo. </w:t>
       </w:r>
       <w:hyperlink r:id="rId33" w:tgtFrame="_blank" w:history="1">
         <w:r>
@@ -7204,7 +6545,6 @@
   <w:style w:type="character" w:default="1" w:styleId="DefaultParagraphFont">
     <w:name w:val="Default Paragraph Font"/>
     <w:uiPriority w:val="1"/>
-    <w:semiHidden/>
     <w:unhideWhenUsed/>
   </w:style>
   <w:style w:type="table" w:default="1" w:styleId="TableNormal">

</xml_diff>